<commit_message>
Add consumer impact section to presentation summary
https://claude.ai/code/session_015dvxDeVpW1fYN1DVAPrAGn
</commit_message>
<xml_diff>
--- a/resumo_apresentacao_crononutricao.docx
+++ b/resumo_apresentacao_crononutricao.docx
@@ -245,6 +245,52 @@
           <w:sz w:val="22"/>
         </w:rPr>
         <w:t>Um app conectado ao wearable identifica em que fase do ciclo biológico você está e indica: agora é hora do whey, ou agora é hora da caseína. O mercado de nutrição personalizada vai de USD 15 bilhões hoje para USD 60 bilhões até 2035. Nenhuma empresa lançou ainda um produto construído em torno do horário biológico. Esse espaço está vazio.</w:t>
+      </w:r>
+    </w:p>
+    <w:p>
+      <w:pPr>
+        <w:spacing w:after="200" w:before="200"/>
+      </w:pPr>
+      <w:r>
+        <w:rPr>
+          <w:rFonts w:ascii="Arial" w:hAnsi="Arial" w:cs="Arial"/>
+          <w:b w:val="0"/>
+          <w:i w:val="0"/>
+          <w:color w:val="B4B4B4"/>
+          <w:sz w:val="20"/>
+        </w:rPr>
+        <w:t>___________________________________________</w:t>
+      </w:r>
+    </w:p>
+    <w:p>
+      <w:pPr>
+        <w:spacing w:after="80" w:before="40"/>
+        <w:jc w:val="left"/>
+      </w:pPr>
+      <w:r>
+        <w:rPr>
+          <w:rFonts w:ascii="Arial" w:hAnsi="Arial" w:cs="Arial"/>
+          <w:b/>
+          <w:i w:val="0"/>
+          <w:color w:val="787878"/>
+          <w:sz w:val="20"/>
+        </w:rPr>
+        <w:t>Impacto no consumidor:</w:t>
+      </w:r>
+    </w:p>
+    <w:p>
+      <w:pPr>
+        <w:spacing w:after="80" w:before="0"/>
+        <w:jc w:val="left"/>
+      </w:pPr>
+      <w:r>
+        <w:rPr>
+          <w:rFonts w:ascii="Arial" w:hAnsi="Arial" w:cs="Arial"/>
+          <w:b w:val="0"/>
+          <w:i w:val="0"/>
+          <w:sz w:val="22"/>
+        </w:rPr>
+        <w:t>O consumidor para de comprar um produto genérico e passa a seguir um protocolo feito pra ele. Isso muda a relação com o suplemento: de algo que se toma por hábito para algo que se usa com propósito. A expectativa de resultado aumenta, a fidelidade à marca também. Quem entrega essa experiência deixa de competir por preço e passa a competir por confiança.</w:t>
       </w:r>
     </w:p>
     <w:p>

</xml_diff>

<commit_message>
Reorder summary blocks: practical evidence before science explanation
https://claude.ai/code/session_015dvxDeVpW1fYN1DVAPrAGn
</commit_message>
<xml_diff>
--- a/resumo_apresentacao_crononutricao.docx
+++ b/resumo_apresentacao_crononutricao.docx
@@ -91,7 +91,7 @@
           <w:color w:val="787878"/>
           <w:sz w:val="20"/>
         </w:rPr>
-        <w:t>O que a ciência descobriu:</w:t>
+        <w:t>O que os estudos mostram na prática:</w:t>
       </w:r>
     </w:p>
     <w:p>
@@ -106,7 +106,7 @@
           <w:i w:val="0"/>
           <w:sz w:val="22"/>
         </w:rPr>
-        <w:t>O músculo tem um relógio interno. Ele define, hora a hora, quando está no modo de construção e quando está no modo de degradação. E esse ritmo é individual: cada pessoa tem o seu próprio horário de pico de construção muscular.</w:t>
+        <w:t>Mesma dose, horários diferentes, resultados diferentes. Pessoas que tomaram proteína à noite ganharam mais massa muscular do que quem tomou à tarde. Quem concentrou mais proteína de manhã teve melhor força. Não existe horário certo para todo mundo. O horário ideal é individual.</w:t>
       </w:r>
     </w:p>
     <w:p>
@@ -137,7 +137,7 @@
           <w:color w:val="787878"/>
           <w:sz w:val="20"/>
         </w:rPr>
-        <w:t>O que os estudos mostram na prática:</w:t>
+        <w:t>O que a ciência descobriu:</w:t>
       </w:r>
     </w:p>
     <w:p>
@@ -152,7 +152,7 @@
           <w:i w:val="0"/>
           <w:sz w:val="22"/>
         </w:rPr>
-        <w:t>Mesma dose, horários diferentes, resultados diferentes. Pessoas que tomaram proteína à noite ganharam mais massa muscular do que quem tomou à tarde. Quem concentrou mais proteína de manhã teve melhor força. Não existe horário certo para todo mundo. O horário ideal é individual.</w:t>
+        <w:t>O músculo tem um relógio interno. Ele define, hora a hora, quando está no modo de construção e quando está no modo de degradação. E esse ritmo é individual: cada pessoa tem o seu próprio horário de pico de construção muscular.</w:t>
       </w:r>
     </w:p>
     <w:p>

</xml_diff>

<commit_message>
Remove closing label from presentation summary
https://claude.ai/code/session_015dvxDeVpW1fYN1DVAPrAGn
</commit_message>
<xml_diff>
--- a/resumo_apresentacao_crononutricao.docx
+++ b/resumo_apresentacao_crononutricao.docx
@@ -306,22 +306,6 @@
           <w:sz w:val="20"/>
         </w:rPr>
         <w:t>___________________________________________</w:t>
-      </w:r>
-    </w:p>
-    <w:p>
-      <w:pPr>
-        <w:spacing w:after="80" w:before="40"/>
-        <w:jc w:val="left"/>
-      </w:pPr>
-      <w:r>
-        <w:rPr>
-          <w:rFonts w:ascii="Arial" w:hAnsi="Arial" w:cs="Arial"/>
-          <w:b/>
-          <w:i w:val="0"/>
-          <w:color w:val="787878"/>
-          <w:sz w:val="20"/>
-        </w:rPr>
-        <w:t>Fecha com a ideia central:</w:t>
       </w:r>
     </w:p>
     <w:p>

</xml_diff>